<commit_message>
Agrega autores y documento final del Taller 3
</commit_message>
<xml_diff>
--- a/workshops/03-IR-comision-de-la-verdad/docs/analisis-taller3-IR.docx
+++ b/workshops/03-IR-comision-de-la-verdad/docs/analisis-taller3-IR.docx
@@ -252,7 +252,7 @@
           </w:tcPr>
           <w:p>
             <w:pPr>
-              <w:jc w:val="right"/>
+              <w:jc w:val="left"/>
             </w:pPr>
             <w:r>
               <w:rPr>
@@ -329,7 +329,7 @@
           </w:tcPr>
           <w:p>
             <w:pPr>
-              <w:jc w:val="right"/>
+              <w:jc w:val="left"/>
             </w:pPr>
             <w:r>
               <w:rPr>
@@ -406,7 +406,7 @@
           </w:tcPr>
           <w:p>
             <w:pPr>
-              <w:jc w:val="right"/>
+              <w:jc w:val="left"/>
             </w:pPr>
             <w:r>
               <w:rPr>
@@ -483,7 +483,7 @@
           </w:tcPr>
           <w:p>
             <w:pPr>
-              <w:jc w:val="right"/>
+              <w:jc w:val="left"/>
             </w:pPr>
             <w:r>
               <w:rPr>
@@ -606,15 +606,17 @@
         </w:tblBorders>
       </w:tblPr>
       <w:tblGrid>
-        <w:gridCol w:w="2800"/>
-        <w:gridCol w:w="2200"/>
-        <w:gridCol w:w="2200"/>
-        <w:gridCol w:w="2160"/>
+        <w:gridCol w:w="1900"/>
+        <w:gridCol w:w="2000"/>
+        <w:gridCol w:w="1700"/>
+        <w:gridCol w:w="1350"/>
+        <w:gridCol w:w="1350"/>
+        <w:gridCol w:w="1660"/>
       </w:tblGrid>
       <w:tr>
         <w:tc>
           <w:tcPr>
-            <w:tcW w:type="dxa" w:w="2800"/>
+            <w:tcW w:type="dxa" w:w="1900"/>
             <w:shd w:fill="2F5496" w:val="clear"/>
             <w:tcMar>
               <w:top w:type="dxa" w:w="40"/>
@@ -641,7 +643,7 @@
         </w:tc>
         <w:tc>
           <w:tcPr>
-            <w:tcW w:type="dxa" w:w="2200"/>
+            <w:tcW w:type="dxa" w:w="2000"/>
             <w:shd w:fill="2F5496" w:val="clear"/>
             <w:tcMar>
               <w:top w:type="dxa" w:w="40"/>
@@ -662,13 +664,13 @@
                 <w:sz w:val="18"/>
                 <w:szCs w:val="18"/>
               </w:rPr>
-              <w:t xml:space="preserve">Vocabulario</w:t>
-            </w:r>
-          </w:p>
-        </w:tc>
-        <w:tc>
-          <w:tcPr>
-            <w:tcW w:type="dxa" w:w="2200"/>
+              <w:t xml:space="preserve">Versión</w:t>
+            </w:r>
+          </w:p>
+        </w:tc>
+        <w:tc>
+          <w:tcPr>
+            <w:tcW w:type="dxa" w:w="1700"/>
             <w:shd w:fill="2F5496" w:val="clear"/>
             <w:tcMar>
               <w:top w:type="dxa" w:w="40"/>
@@ -689,13 +691,13 @@
                 <w:sz w:val="18"/>
                 <w:szCs w:val="18"/>
               </w:rPr>
-              <w:t xml:space="preserve">TTR</w:t>
-            </w:r>
-          </w:p>
-        </w:tc>
-        <w:tc>
-          <w:tcPr>
-            <w:tcW w:type="dxa" w:w="2160"/>
+              <w:t xml:space="preserve">Vocabulario</w:t>
+            </w:r>
+          </w:p>
+        </w:tc>
+        <w:tc>
+          <w:tcPr>
+            <w:tcW w:type="dxa" w:w="1350"/>
             <w:shd w:fill="2F5496" w:val="clear"/>
             <w:tcMar>
               <w:top w:type="dxa" w:w="40"/>
@@ -716,6 +718,60 @@
                 <w:sz w:val="18"/>
                 <w:szCs w:val="18"/>
               </w:rPr>
+              <w:t xml:space="preserve">TTR</w:t>
+            </w:r>
+          </w:p>
+        </w:tc>
+        <w:tc>
+          <w:tcPr>
+            <w:tcW w:type="dxa" w:w="1350"/>
+            <w:shd w:fill="2F5496" w:val="clear"/>
+            <w:tcMar>
+              <w:top w:type="dxa" w:w="40"/>
+              <w:left w:type="dxa" w:w="80"/>
+              <w:bottom w:type="dxa" w:w="40"/>
+              <w:right w:type="dxa" w:w="80"/>
+            </w:tcMar>
+          </w:tcPr>
+          <w:p>
+            <w:pPr>
+              <w:jc w:val="left"/>
+            </w:pPr>
+            <w:r>
+              <w:rPr>
+                <w:b/>
+                <w:bCs/>
+                <w:color w:val="FFFFFF"/>
+                <w:sz w:val="18"/>
+                <w:szCs w:val="18"/>
+              </w:rPr>
+              <w:t xml:space="preserve">Hapax</w:t>
+            </w:r>
+          </w:p>
+        </w:tc>
+        <w:tc>
+          <w:tcPr>
+            <w:tcW w:type="dxa" w:w="1660"/>
+            <w:shd w:fill="2F5496" w:val="clear"/>
+            <w:tcMar>
+              <w:top w:type="dxa" w:w="40"/>
+              <w:left w:type="dxa" w:w="80"/>
+              <w:bottom w:type="dxa" w:w="40"/>
+              <w:right w:type="dxa" w:w="80"/>
+            </w:tcMar>
+          </w:tcPr>
+          <w:p>
+            <w:pPr>
+              <w:jc w:val="left"/>
+            </w:pPr>
+            <w:r>
+              <w:rPr>
+                <w:b/>
+                <w:bCs/>
+                <w:color w:val="FFFFFF"/>
+                <w:sz w:val="18"/>
+                <w:szCs w:val="18"/>
+              </w:rPr>
               <w:t xml:space="preserve">Long. mediana (tok.)</w:t>
             </w:r>
           </w:p>
@@ -724,32 +780,32 @@
       <w:tr>
         <w:tc>
           <w:tcPr>
-            <w:tcW w:type="dxa" w:w="2800"/>
-            <w:tcMar>
-              <w:top w:type="dxa" w:w="40"/>
-              <w:left w:type="dxa" w:w="80"/>
-              <w:bottom w:type="dxa" w:w="40"/>
-              <w:right w:type="dxa" w:w="80"/>
-            </w:tcMar>
-          </w:tcPr>
-          <w:p>
-            <w:pPr>
-              <w:jc w:val="left"/>
-            </w:pPr>
-            <w:r>
-              <w:rPr>
-                <w:b w:val="false"/>
-                <w:bCs w:val="false"/>
-                <w:sz w:val="18"/>
-                <w:szCs w:val="18"/>
-              </w:rPr>
-              <w:t xml:space="preserve">Libros (preproc.)</w:t>
-            </w:r>
-          </w:p>
-        </w:tc>
-        <w:tc>
-          <w:tcPr>
-            <w:tcW w:type="dxa" w:w="2200"/>
+            <w:tcW w:type="dxa" w:w="1900"/>
+            <w:tcMar>
+              <w:top w:type="dxa" w:w="40"/>
+              <w:left w:type="dxa" w:w="80"/>
+              <w:bottom w:type="dxa" w:w="40"/>
+              <w:right w:type="dxa" w:w="80"/>
+            </w:tcMar>
+          </w:tcPr>
+          <w:p>
+            <w:pPr>
+              <w:jc w:val="left"/>
+            </w:pPr>
+            <w:r>
+              <w:rPr>
+                <w:b w:val="false"/>
+                <w:bCs w:val="false"/>
+                <w:sz w:val="18"/>
+                <w:szCs w:val="18"/>
+              </w:rPr>
+              <w:t xml:space="preserve">Libros</w:t>
+            </w:r>
+          </w:p>
+        </w:tc>
+        <w:tc>
+          <w:tcPr>
+            <w:tcW w:type="dxa" w:w="2000"/>
             <w:tcMar>
               <w:top w:type="dxa" w:w="40"/>
               <w:left w:type="dxa" w:w="80"/>
@@ -768,13 +824,13 @@
                 <w:sz w:val="18"/>
                 <w:szCs w:val="18"/>
               </w:rPr>
-              <w:t xml:space="preserve">35.475</w:t>
-            </w:r>
-          </w:p>
-        </w:tc>
-        <w:tc>
-          <w:tcPr>
-            <w:tcW w:type="dxa" w:w="2200"/>
+              <w:t xml:space="preserve">Crudo</w:t>
+            </w:r>
+          </w:p>
+        </w:tc>
+        <w:tc>
+          <w:tcPr>
+            <w:tcW w:type="dxa" w:w="1700"/>
             <w:tcMar>
               <w:top w:type="dxa" w:w="40"/>
               <w:left w:type="dxa" w:w="80"/>
@@ -793,13 +849,13 @@
                 <w:sz w:val="18"/>
                 <w:szCs w:val="18"/>
               </w:rPr>
-              <w:t xml:space="preserve">0,0329</w:t>
-            </w:r>
-          </w:p>
-        </w:tc>
-        <w:tc>
-          <w:tcPr>
-            <w:tcW w:type="dxa" w:w="2160"/>
+              <w:t xml:space="preserve">51.091</w:t>
+            </w:r>
+          </w:p>
+        </w:tc>
+        <w:tc>
+          <w:tcPr>
+            <w:tcW w:type="dxa" w:w="1350"/>
             <w:tcMar>
               <w:top w:type="dxa" w:w="40"/>
               <w:left w:type="dxa" w:w="80"/>
@@ -818,7 +874,57 @@
                 <w:sz w:val="18"/>
                 <w:szCs w:val="18"/>
               </w:rPr>
-              <w:t xml:space="preserve">11</w:t>
+              <w:t xml:space="preserve">0,0231</w:t>
+            </w:r>
+          </w:p>
+        </w:tc>
+        <w:tc>
+          <w:tcPr>
+            <w:tcW w:type="dxa" w:w="1350"/>
+            <w:tcMar>
+              <w:top w:type="dxa" w:w="40"/>
+              <w:left w:type="dxa" w:w="80"/>
+              <w:bottom w:type="dxa" w:w="40"/>
+              <w:right w:type="dxa" w:w="80"/>
+            </w:tcMar>
+          </w:tcPr>
+          <w:p>
+            <w:pPr>
+              <w:jc w:val="right"/>
+            </w:pPr>
+            <w:r>
+              <w:rPr>
+                <w:b w:val="false"/>
+                <w:bCs w:val="false"/>
+                <w:sz w:val="18"/>
+                <w:szCs w:val="18"/>
+              </w:rPr>
+              <w:t xml:space="preserve">37,8 %</w:t>
+            </w:r>
+          </w:p>
+        </w:tc>
+        <w:tc>
+          <w:tcPr>
+            <w:tcW w:type="dxa" w:w="1660"/>
+            <w:tcMar>
+              <w:top w:type="dxa" w:w="40"/>
+              <w:left w:type="dxa" w:w="80"/>
+              <w:bottom w:type="dxa" w:w="40"/>
+              <w:right w:type="dxa" w:w="80"/>
+            </w:tcMar>
+          </w:tcPr>
+          <w:p>
+            <w:pPr>
+              <w:jc w:val="right"/>
+            </w:pPr>
+            <w:r>
+              <w:rPr>
+                <w:b w:val="false"/>
+                <w:bCs w:val="false"/>
+                <w:sz w:val="18"/>
+                <w:szCs w:val="18"/>
+              </w:rPr>
+              <w:t xml:space="preserve">17</w:t>
             </w:r>
           </w:p>
         </w:tc>
@@ -826,32 +932,32 @@
       <w:tr>
         <w:tc>
           <w:tcPr>
-            <w:tcW w:type="dxa" w:w="2800"/>
-            <w:tcMar>
-              <w:top w:type="dxa" w:w="40"/>
-              <w:left w:type="dxa" w:w="80"/>
-              <w:bottom w:type="dxa" w:w="40"/>
-              <w:right w:type="dxa" w:w="80"/>
-            </w:tcMar>
-          </w:tcPr>
-          <w:p>
-            <w:pPr>
-              <w:jc w:val="left"/>
-            </w:pPr>
-            <w:r>
-              <w:rPr>
-                <w:b w:val="false"/>
-                <w:bCs w:val="false"/>
-                <w:sz w:val="18"/>
-                <w:szCs w:val="18"/>
-              </w:rPr>
-              <w:t xml:space="preserve">Entrevistas (preproc.)</w:t>
-            </w:r>
-          </w:p>
-        </w:tc>
-        <w:tc>
-          <w:tcPr>
-            <w:tcW w:type="dxa" w:w="2200"/>
+            <w:tcW w:type="dxa" w:w="1900"/>
+            <w:tcMar>
+              <w:top w:type="dxa" w:w="40"/>
+              <w:left w:type="dxa" w:w="80"/>
+              <w:bottom w:type="dxa" w:w="40"/>
+              <w:right w:type="dxa" w:w="80"/>
+            </w:tcMar>
+          </w:tcPr>
+          <w:p>
+            <w:pPr>
+              <w:jc w:val="left"/>
+            </w:pPr>
+            <w:r>
+              <w:rPr>
+                <w:b w:val="false"/>
+                <w:bCs w:val="false"/>
+                <w:sz w:val="18"/>
+                <w:szCs w:val="18"/>
+              </w:rPr>
+              <w:t xml:space="preserve">Libros</w:t>
+            </w:r>
+          </w:p>
+        </w:tc>
+        <w:tc>
+          <w:tcPr>
+            <w:tcW w:type="dxa" w:w="2000"/>
             <w:tcMar>
               <w:top w:type="dxa" w:w="40"/>
               <w:left w:type="dxa" w:w="80"/>
@@ -870,13 +976,342 @@
                 <w:sz w:val="18"/>
                 <w:szCs w:val="18"/>
               </w:rPr>
+              <w:t xml:space="preserve">Preprocesado</w:t>
+            </w:r>
+          </w:p>
+        </w:tc>
+        <w:tc>
+          <w:tcPr>
+            <w:tcW w:type="dxa" w:w="1700"/>
+            <w:tcMar>
+              <w:top w:type="dxa" w:w="40"/>
+              <w:left w:type="dxa" w:w="80"/>
+              <w:bottom w:type="dxa" w:w="40"/>
+              <w:right w:type="dxa" w:w="80"/>
+            </w:tcMar>
+          </w:tcPr>
+          <w:p>
+            <w:pPr>
+              <w:jc w:val="right"/>
+            </w:pPr>
+            <w:r>
+              <w:rPr>
+                <w:b w:val="false"/>
+                <w:bCs w:val="false"/>
+                <w:sz w:val="18"/>
+                <w:szCs w:val="18"/>
+              </w:rPr>
+              <w:t xml:space="preserve">35.475</w:t>
+            </w:r>
+          </w:p>
+        </w:tc>
+        <w:tc>
+          <w:tcPr>
+            <w:tcW w:type="dxa" w:w="1350"/>
+            <w:tcMar>
+              <w:top w:type="dxa" w:w="40"/>
+              <w:left w:type="dxa" w:w="80"/>
+              <w:bottom w:type="dxa" w:w="40"/>
+              <w:right w:type="dxa" w:w="80"/>
+            </w:tcMar>
+          </w:tcPr>
+          <w:p>
+            <w:pPr>
+              <w:jc w:val="right"/>
+            </w:pPr>
+            <w:r>
+              <w:rPr>
+                <w:b w:val="false"/>
+                <w:bCs w:val="false"/>
+                <w:sz w:val="18"/>
+                <w:szCs w:val="18"/>
+              </w:rPr>
+              <w:t xml:space="preserve">0,0329</w:t>
+            </w:r>
+          </w:p>
+        </w:tc>
+        <w:tc>
+          <w:tcPr>
+            <w:tcW w:type="dxa" w:w="1350"/>
+            <w:tcMar>
+              <w:top w:type="dxa" w:w="40"/>
+              <w:left w:type="dxa" w:w="80"/>
+              <w:bottom w:type="dxa" w:w="40"/>
+              <w:right w:type="dxa" w:w="80"/>
+            </w:tcMar>
+          </w:tcPr>
+          <w:p>
+            <w:pPr>
+              <w:jc w:val="right"/>
+            </w:pPr>
+            <w:r>
+              <w:rPr>
+                <w:b w:val="false"/>
+                <w:bCs w:val="false"/>
+                <w:sz w:val="18"/>
+                <w:szCs w:val="18"/>
+              </w:rPr>
+              <w:t xml:space="preserve">37,5 %</w:t>
+            </w:r>
+          </w:p>
+        </w:tc>
+        <w:tc>
+          <w:tcPr>
+            <w:tcW w:type="dxa" w:w="1660"/>
+            <w:tcMar>
+              <w:top w:type="dxa" w:w="40"/>
+              <w:left w:type="dxa" w:w="80"/>
+              <w:bottom w:type="dxa" w:w="40"/>
+              <w:right w:type="dxa" w:w="80"/>
+            </w:tcMar>
+          </w:tcPr>
+          <w:p>
+            <w:pPr>
+              <w:jc w:val="right"/>
+            </w:pPr>
+            <w:r>
+              <w:rPr>
+                <w:b w:val="false"/>
+                <w:bCs w:val="false"/>
+                <w:sz w:val="18"/>
+                <w:szCs w:val="18"/>
+              </w:rPr>
+              <w:t xml:space="preserve">11</w:t>
+            </w:r>
+          </w:p>
+        </w:tc>
+      </w:tr>
+      <w:tr>
+        <w:tc>
+          <w:tcPr>
+            <w:tcW w:type="dxa" w:w="1900"/>
+            <w:tcMar>
+              <w:top w:type="dxa" w:w="40"/>
+              <w:left w:type="dxa" w:w="80"/>
+              <w:bottom w:type="dxa" w:w="40"/>
+              <w:right w:type="dxa" w:w="80"/>
+            </w:tcMar>
+          </w:tcPr>
+          <w:p>
+            <w:pPr>
+              <w:jc w:val="left"/>
+            </w:pPr>
+            <w:r>
+              <w:rPr>
+                <w:b w:val="false"/>
+                <w:bCs w:val="false"/>
+                <w:sz w:val="18"/>
+                <w:szCs w:val="18"/>
+              </w:rPr>
+              <w:t xml:space="preserve">Entrevistas</w:t>
+            </w:r>
+          </w:p>
+        </w:tc>
+        <w:tc>
+          <w:tcPr>
+            <w:tcW w:type="dxa" w:w="2000"/>
+            <w:tcMar>
+              <w:top w:type="dxa" w:w="40"/>
+              <w:left w:type="dxa" w:w="80"/>
+              <w:bottom w:type="dxa" w:w="40"/>
+              <w:right w:type="dxa" w:w="80"/>
+            </w:tcMar>
+          </w:tcPr>
+          <w:p>
+            <w:pPr>
+              <w:jc w:val="right"/>
+            </w:pPr>
+            <w:r>
+              <w:rPr>
+                <w:b w:val="false"/>
+                <w:bCs w:val="false"/>
+                <w:sz w:val="18"/>
+                <w:szCs w:val="18"/>
+              </w:rPr>
+              <w:t xml:space="preserve">Crudo</w:t>
+            </w:r>
+          </w:p>
+        </w:tc>
+        <w:tc>
+          <w:tcPr>
+            <w:tcW w:type="dxa" w:w="1700"/>
+            <w:tcMar>
+              <w:top w:type="dxa" w:w="40"/>
+              <w:left w:type="dxa" w:w="80"/>
+              <w:bottom w:type="dxa" w:w="40"/>
+              <w:right w:type="dxa" w:w="80"/>
+            </w:tcMar>
+          </w:tcPr>
+          <w:p>
+            <w:pPr>
+              <w:jc w:val="right"/>
+            </w:pPr>
+            <w:r>
+              <w:rPr>
+                <w:b w:val="false"/>
+                <w:bCs w:val="false"/>
+                <w:sz w:val="18"/>
+                <w:szCs w:val="18"/>
+              </w:rPr>
+              <w:t xml:space="preserve">148.026</w:t>
+            </w:r>
+          </w:p>
+        </w:tc>
+        <w:tc>
+          <w:tcPr>
+            <w:tcW w:type="dxa" w:w="1350"/>
+            <w:tcMar>
+              <w:top w:type="dxa" w:w="40"/>
+              <w:left w:type="dxa" w:w="80"/>
+              <w:bottom w:type="dxa" w:w="40"/>
+              <w:right w:type="dxa" w:w="80"/>
+            </w:tcMar>
+          </w:tcPr>
+          <w:p>
+            <w:pPr>
+              <w:jc w:val="right"/>
+            </w:pPr>
+            <w:r>
+              <w:rPr>
+                <w:b w:val="false"/>
+                <w:bCs w:val="false"/>
+                <w:sz w:val="18"/>
+                <w:szCs w:val="18"/>
+              </w:rPr>
+              <w:t xml:space="preserve">0,0043</w:t>
+            </w:r>
+          </w:p>
+        </w:tc>
+        <w:tc>
+          <w:tcPr>
+            <w:tcW w:type="dxa" w:w="1350"/>
+            <w:tcMar>
+              <w:top w:type="dxa" w:w="40"/>
+              <w:left w:type="dxa" w:w="80"/>
+              <w:bottom w:type="dxa" w:w="40"/>
+              <w:right w:type="dxa" w:w="80"/>
+            </w:tcMar>
+          </w:tcPr>
+          <w:p>
+            <w:pPr>
+              <w:jc w:val="right"/>
+            </w:pPr>
+            <w:r>
+              <w:rPr>
+                <w:b w:val="false"/>
+                <w:bCs w:val="false"/>
+                <w:sz w:val="18"/>
+                <w:szCs w:val="18"/>
+              </w:rPr>
+              <w:t xml:space="preserve">35,5 %</w:t>
+            </w:r>
+          </w:p>
+        </w:tc>
+        <w:tc>
+          <w:tcPr>
+            <w:tcW w:type="dxa" w:w="1660"/>
+            <w:tcMar>
+              <w:top w:type="dxa" w:w="40"/>
+              <w:left w:type="dxa" w:w="80"/>
+              <w:bottom w:type="dxa" w:w="40"/>
+              <w:right w:type="dxa" w:w="80"/>
+            </w:tcMar>
+          </w:tcPr>
+          <w:p>
+            <w:pPr>
+              <w:jc w:val="right"/>
+            </w:pPr>
+            <w:r>
+              <w:rPr>
+                <w:b w:val="false"/>
+                <w:bCs w:val="false"/>
+                <w:sz w:val="18"/>
+                <w:szCs w:val="18"/>
+              </w:rPr>
+              <w:t xml:space="preserve">11.524</w:t>
+            </w:r>
+          </w:p>
+        </w:tc>
+      </w:tr>
+      <w:tr>
+        <w:tc>
+          <w:tcPr>
+            <w:tcW w:type="dxa" w:w="1900"/>
+            <w:tcMar>
+              <w:top w:type="dxa" w:w="40"/>
+              <w:left w:type="dxa" w:w="80"/>
+              <w:bottom w:type="dxa" w:w="40"/>
+              <w:right w:type="dxa" w:w="80"/>
+            </w:tcMar>
+          </w:tcPr>
+          <w:p>
+            <w:pPr>
+              <w:jc w:val="left"/>
+            </w:pPr>
+            <w:r>
+              <w:rPr>
+                <w:b w:val="false"/>
+                <w:bCs w:val="false"/>
+                <w:sz w:val="18"/>
+                <w:szCs w:val="18"/>
+              </w:rPr>
+              <w:t xml:space="preserve">Entrevistas</w:t>
+            </w:r>
+          </w:p>
+        </w:tc>
+        <w:tc>
+          <w:tcPr>
+            <w:tcW w:type="dxa" w:w="2000"/>
+            <w:tcMar>
+              <w:top w:type="dxa" w:w="40"/>
+              <w:left w:type="dxa" w:w="80"/>
+              <w:bottom w:type="dxa" w:w="40"/>
+              <w:right w:type="dxa" w:w="80"/>
+            </w:tcMar>
+          </w:tcPr>
+          <w:p>
+            <w:pPr>
+              <w:jc w:val="right"/>
+            </w:pPr>
+            <w:r>
+              <w:rPr>
+                <w:b w:val="false"/>
+                <w:bCs w:val="false"/>
+                <w:sz w:val="18"/>
+                <w:szCs w:val="18"/>
+              </w:rPr>
+              <w:t xml:space="preserve">Preprocesado</w:t>
+            </w:r>
+          </w:p>
+        </w:tc>
+        <w:tc>
+          <w:tcPr>
+            <w:tcW w:type="dxa" w:w="1700"/>
+            <w:tcMar>
+              <w:top w:type="dxa" w:w="40"/>
+              <w:left w:type="dxa" w:w="80"/>
+              <w:bottom w:type="dxa" w:w="40"/>
+              <w:right w:type="dxa" w:w="80"/>
+            </w:tcMar>
+          </w:tcPr>
+          <w:p>
+            <w:pPr>
+              <w:jc w:val="right"/>
+            </w:pPr>
+            <w:r>
+              <w:rPr>
+                <w:b w:val="false"/>
+                <w:bCs w:val="false"/>
+                <w:sz w:val="18"/>
+                <w:szCs w:val="18"/>
+              </w:rPr>
               <w:t xml:space="preserve">103.416</w:t>
             </w:r>
           </w:p>
         </w:tc>
         <w:tc>
           <w:tcPr>
-            <w:tcW w:type="dxa" w:w="2200"/>
+            <w:tcW w:type="dxa" w:w="1350"/>
             <w:tcMar>
               <w:top w:type="dxa" w:w="40"/>
               <w:left w:type="dxa" w:w="80"/>
@@ -901,7 +1336,32 @@
         </w:tc>
         <w:tc>
           <w:tcPr>
-            <w:tcW w:type="dxa" w:w="2160"/>
+            <w:tcW w:type="dxa" w:w="1350"/>
+            <w:tcMar>
+              <w:top w:type="dxa" w:w="40"/>
+              <w:left w:type="dxa" w:w="80"/>
+              <w:bottom w:type="dxa" w:w="40"/>
+              <w:right w:type="dxa" w:w="80"/>
+            </w:tcMar>
+          </w:tcPr>
+          <w:p>
+            <w:pPr>
+              <w:jc w:val="right"/>
+            </w:pPr>
+            <w:r>
+              <w:rPr>
+                <w:b w:val="false"/>
+                <w:bCs w:val="false"/>
+                <w:sz w:val="18"/>
+                <w:szCs w:val="18"/>
+              </w:rPr>
+              <w:t xml:space="preserve">40,4 %</w:t>
+            </w:r>
+          </w:p>
+        </w:tc>
+        <w:tc>
+          <w:tcPr>
+            <w:tcW w:type="dxa" w:w="1660"/>
             <w:tcMar>
               <w:top w:type="dxa" w:w="40"/>
               <w:left w:type="dxa" w:w="80"/>
@@ -1224,7 +1684,7 @@
           </w:tcPr>
           <w:p>
             <w:pPr>
-              <w:jc w:val="right"/>
+              <w:jc w:val="left"/>
             </w:pPr>
             <w:r>
               <w:rPr>
@@ -1249,7 +1709,7 @@
           </w:tcPr>
           <w:p>
             <w:pPr>
-              <w:jc w:val="right"/>
+              <w:jc w:val="left"/>
             </w:pPr>
             <w:r>
               <w:rPr>
@@ -1326,7 +1786,7 @@
           </w:tcPr>
           <w:p>
             <w:pPr>
-              <w:jc w:val="right"/>
+              <w:jc w:val="left"/>
             </w:pPr>
             <w:r>
               <w:rPr>
@@ -1351,7 +1811,7 @@
           </w:tcPr>
           <w:p>
             <w:pPr>
-              <w:jc w:val="right"/>
+              <w:jc w:val="left"/>
             </w:pPr>
             <w:r>
               <w:rPr>
@@ -1428,7 +1888,7 @@
           </w:tcPr>
           <w:p>
             <w:pPr>
-              <w:jc w:val="right"/>
+              <w:jc w:val="left"/>
             </w:pPr>
             <w:r>
               <w:rPr>
@@ -1453,7 +1913,7 @@
           </w:tcPr>
           <w:p>
             <w:pPr>
-              <w:jc w:val="right"/>
+              <w:jc w:val="left"/>
             </w:pPr>
             <w:r>
               <w:rPr>
@@ -1477,7 +1937,7 @@
           <w:sz w:val="20"/>
           <w:szCs w:val="20"/>
         </w:rPr>
-        <w:t xml:space="preserve">La validación cualitativa confirma que el modelo recupera coincidencias reales: en pares de puntaje alto (&gt;0,8, el 6,6 % de las entrevistas) el libro cita literalmente el testimonio de la entrevista, y entre 0,4 y 0,6 la relación es temática. El ranking oficial (data/ranking_tfidf.json) usa L2×L2, k=20 y no conserva variante sin normalizar: quitarla cambió 4 o 5 de 5 posiciones del top-5 en la prueba de verificación.</w:t>
+        <w:t xml:space="preserve">La validación cualitativa confirma que el modelo recupera coincidencias reales: en pares de puntaje alto (&gt;0,8, el 6,6 % de las entrevistas) el libro cita literalmente el testimonio de la entrevista, y entre 0,4 y 0,6 la relación es temática. El top-1 del ranking oficial tiene similitud media 0,5274, mediana 0,4809 y máximo 0,9866, con 1.801 unidades distintas en el top-1 y 9.950 unidades distintas en el conjunto de los top-20 guardados. El ranking (data/ranking_tfidf.json) usa L2×L2, k=20 y no conserva variante sin normalizar: quitarla cambió 4 o 5 de 5 posiciones del top-5 en la prueba de verificación.</w:t>
       </w:r>
     </w:p>
     <w:p>
@@ -1664,7 +2124,7 @@
           </w:tcPr>
           <w:p>
             <w:pPr>
-              <w:jc w:val="right"/>
+              <w:jc w:val="left"/>
             </w:pPr>
             <w:r>
               <w:rPr>
@@ -1741,7 +2201,7 @@
           </w:tcPr>
           <w:p>
             <w:pPr>
-              <w:jc w:val="right"/>
+              <w:jc w:val="left"/>
             </w:pPr>
             <w:r>
               <w:rPr>
@@ -1818,7 +2278,7 @@
           </w:tcPr>
           <w:p>
             <w:pPr>
-              <w:jc w:val="right"/>
+              <w:jc w:val="left"/>
             </w:pPr>
             <w:r>
               <w:rPr>
@@ -1863,9 +2323,602 @@
           <w:sz w:val="20"/>
           <w:szCs w:val="20"/>
         </w:rPr>
-        <w:t xml:space="preserve">El cuadro y el heatmap entrevista-libro se construyeron sobre el ranking TF-IDF oficial (no Rocchio ni BM25), por ser la línea base validada del punto 3 y no depender de pseudo-relevancia. El reparto del libro ganador ya no está dominado por un solo tomo: Cuando los pájaros no cantaban (778), Hasta la guerra tiene límites (710), La Colombia fuera de Colombia (214), No matarás (161) y Resistir no es aguantar (155) concentran la mayoría de los vínculos; Convocatoria a la paz grande no gana ninguna entrevista pero permanece en la matriz completa.</w:t>
-      </w:r>
-    </w:p>
+        <w:t xml:space="preserve">El cuadro y el heatmap entrevista-libro se construyeron sobre el ranking TF-IDF oficial (no Rocchio ni BM25), por ser la línea base validada del punto 3 y no depender de pseudo-relevancia. El reparto del libro ganador ya no está dominado por un solo tomo:</w:t>
+      </w:r>
+    </w:p>
+    <w:tbl>
+      <w:tblPr>
+        <w:tblW w:type="dxa" w:w="10080"/>
+        <w:tblBorders>
+          <w:top w:val="single" w:color="auto" w:sz="4"/>
+          <w:left w:val="single" w:color="auto" w:sz="4"/>
+          <w:bottom w:val="single" w:color="auto" w:sz="4"/>
+          <w:right w:val="single" w:color="auto" w:sz="4"/>
+          <w:insideH w:val="single" w:color="auto" w:sz="4"/>
+          <w:insideV w:val="single" w:color="auto" w:sz="4"/>
+        </w:tblBorders>
+      </w:tblPr>
+      <w:tblGrid>
+        <w:gridCol w:w="6560"/>
+        <w:gridCol w:w="2960"/>
+      </w:tblGrid>
+      <w:tr>
+        <w:tc>
+          <w:tcPr>
+            <w:tcW w:type="dxa" w:w="6560"/>
+            <w:shd w:fill="2F5496" w:val="clear"/>
+            <w:tcMar>
+              <w:top w:type="dxa" w:w="40"/>
+              <w:left w:type="dxa" w:w="80"/>
+              <w:bottom w:type="dxa" w:w="40"/>
+              <w:right w:type="dxa" w:w="80"/>
+            </w:tcMar>
+          </w:tcPr>
+          <w:p>
+            <w:pPr>
+              <w:jc w:val="left"/>
+            </w:pPr>
+            <w:r>
+              <w:rPr>
+                <w:b/>
+                <w:bCs/>
+                <w:color w:val="FFFFFF"/>
+                <w:sz w:val="18"/>
+                <w:szCs w:val="18"/>
+              </w:rPr>
+              <w:t xml:space="preserve">Libro</w:t>
+            </w:r>
+          </w:p>
+        </w:tc>
+        <w:tc>
+          <w:tcPr>
+            <w:tcW w:type="dxa" w:w="2960"/>
+            <w:shd w:fill="2F5496" w:val="clear"/>
+            <w:tcMar>
+              <w:top w:type="dxa" w:w="40"/>
+              <w:left w:type="dxa" w:w="80"/>
+              <w:bottom w:type="dxa" w:w="40"/>
+              <w:right w:type="dxa" w:w="80"/>
+            </w:tcMar>
+          </w:tcPr>
+          <w:p>
+            <w:pPr>
+              <w:jc w:val="left"/>
+            </w:pPr>
+            <w:r>
+              <w:rPr>
+                <w:b/>
+                <w:bCs/>
+                <w:color w:val="FFFFFF"/>
+                <w:sz w:val="18"/>
+                <w:szCs w:val="18"/>
+              </w:rPr>
+              <w:t xml:space="preserve">Entrevistas ganadoras</w:t>
+            </w:r>
+          </w:p>
+        </w:tc>
+      </w:tr>
+      <w:tr>
+        <w:tc>
+          <w:tcPr>
+            <w:tcW w:type="dxa" w:w="6560"/>
+            <w:tcMar>
+              <w:top w:type="dxa" w:w="40"/>
+              <w:left w:type="dxa" w:w="80"/>
+              <w:bottom w:type="dxa" w:w="40"/>
+              <w:right w:type="dxa" w:w="80"/>
+            </w:tcMar>
+          </w:tcPr>
+          <w:p>
+            <w:pPr>
+              <w:jc w:val="left"/>
+            </w:pPr>
+            <w:r>
+              <w:rPr>
+                <w:b w:val="false"/>
+                <w:bCs w:val="false"/>
+                <w:sz w:val="18"/>
+                <w:szCs w:val="18"/>
+              </w:rPr>
+              <w:t xml:space="preserve">CUANDO_LOS_PAJAROS_NO_CANTABAN</w:t>
+            </w:r>
+          </w:p>
+        </w:tc>
+        <w:tc>
+          <w:tcPr>
+            <w:tcW w:type="dxa" w:w="2960"/>
+            <w:tcMar>
+              <w:top w:type="dxa" w:w="40"/>
+              <w:left w:type="dxa" w:w="80"/>
+              <w:bottom w:type="dxa" w:w="40"/>
+              <w:right w:type="dxa" w:w="80"/>
+            </w:tcMar>
+          </w:tcPr>
+          <w:p>
+            <w:pPr>
+              <w:jc w:val="right"/>
+            </w:pPr>
+            <w:r>
+              <w:rPr>
+                <w:b w:val="false"/>
+                <w:bCs w:val="false"/>
+                <w:sz w:val="18"/>
+                <w:szCs w:val="18"/>
+              </w:rPr>
+              <w:t xml:space="preserve">778</w:t>
+            </w:r>
+          </w:p>
+        </w:tc>
+      </w:tr>
+      <w:tr>
+        <w:tc>
+          <w:tcPr>
+            <w:tcW w:type="dxa" w:w="6560"/>
+            <w:tcMar>
+              <w:top w:type="dxa" w:w="40"/>
+              <w:left w:type="dxa" w:w="80"/>
+              <w:bottom w:type="dxa" w:w="40"/>
+              <w:right w:type="dxa" w:w="80"/>
+            </w:tcMar>
+          </w:tcPr>
+          <w:p>
+            <w:pPr>
+              <w:jc w:val="left"/>
+            </w:pPr>
+            <w:r>
+              <w:rPr>
+                <w:b w:val="false"/>
+                <w:bCs w:val="false"/>
+                <w:sz w:val="18"/>
+                <w:szCs w:val="18"/>
+              </w:rPr>
+              <w:t xml:space="preserve">HASTA_LA_GUERRA_TIENE_LIMITES</w:t>
+            </w:r>
+          </w:p>
+        </w:tc>
+        <w:tc>
+          <w:tcPr>
+            <w:tcW w:type="dxa" w:w="2960"/>
+            <w:tcMar>
+              <w:top w:type="dxa" w:w="40"/>
+              <w:left w:type="dxa" w:w="80"/>
+              <w:bottom w:type="dxa" w:w="40"/>
+              <w:right w:type="dxa" w:w="80"/>
+            </w:tcMar>
+          </w:tcPr>
+          <w:p>
+            <w:pPr>
+              <w:jc w:val="right"/>
+            </w:pPr>
+            <w:r>
+              <w:rPr>
+                <w:b w:val="false"/>
+                <w:bCs w:val="false"/>
+                <w:sz w:val="18"/>
+                <w:szCs w:val="18"/>
+              </w:rPr>
+              <w:t xml:space="preserve">710</w:t>
+            </w:r>
+          </w:p>
+        </w:tc>
+      </w:tr>
+      <w:tr>
+        <w:tc>
+          <w:tcPr>
+            <w:tcW w:type="dxa" w:w="6560"/>
+            <w:tcMar>
+              <w:top w:type="dxa" w:w="40"/>
+              <w:left w:type="dxa" w:w="80"/>
+              <w:bottom w:type="dxa" w:w="40"/>
+              <w:right w:type="dxa" w:w="80"/>
+            </w:tcMar>
+          </w:tcPr>
+          <w:p>
+            <w:pPr>
+              <w:jc w:val="left"/>
+            </w:pPr>
+            <w:r>
+              <w:rPr>
+                <w:b w:val="false"/>
+                <w:bCs w:val="false"/>
+                <w:sz w:val="18"/>
+                <w:szCs w:val="18"/>
+              </w:rPr>
+              <w:t xml:space="preserve">LA_COLOMBIA_FUERA_DE_COLOMBIA</w:t>
+            </w:r>
+          </w:p>
+        </w:tc>
+        <w:tc>
+          <w:tcPr>
+            <w:tcW w:type="dxa" w:w="2960"/>
+            <w:tcMar>
+              <w:top w:type="dxa" w:w="40"/>
+              <w:left w:type="dxa" w:w="80"/>
+              <w:bottom w:type="dxa" w:w="40"/>
+              <w:right w:type="dxa" w:w="80"/>
+            </w:tcMar>
+          </w:tcPr>
+          <w:p>
+            <w:pPr>
+              <w:jc w:val="right"/>
+            </w:pPr>
+            <w:r>
+              <w:rPr>
+                <w:b w:val="false"/>
+                <w:bCs w:val="false"/>
+                <w:sz w:val="18"/>
+                <w:szCs w:val="18"/>
+              </w:rPr>
+              <w:t xml:space="preserve">214</w:t>
+            </w:r>
+          </w:p>
+        </w:tc>
+      </w:tr>
+      <w:tr>
+        <w:tc>
+          <w:tcPr>
+            <w:tcW w:type="dxa" w:w="6560"/>
+            <w:tcMar>
+              <w:top w:type="dxa" w:w="40"/>
+              <w:left w:type="dxa" w:w="80"/>
+              <w:bottom w:type="dxa" w:w="40"/>
+              <w:right w:type="dxa" w:w="80"/>
+            </w:tcMar>
+          </w:tcPr>
+          <w:p>
+            <w:pPr>
+              <w:jc w:val="left"/>
+            </w:pPr>
+            <w:r>
+              <w:rPr>
+                <w:b w:val="false"/>
+                <w:bCs w:val="false"/>
+                <w:sz w:val="18"/>
+                <w:szCs w:val="18"/>
+              </w:rPr>
+              <w:t xml:space="preserve">NO_MATARAS</w:t>
+            </w:r>
+          </w:p>
+        </w:tc>
+        <w:tc>
+          <w:tcPr>
+            <w:tcW w:type="dxa" w:w="2960"/>
+            <w:tcMar>
+              <w:top w:type="dxa" w:w="40"/>
+              <w:left w:type="dxa" w:w="80"/>
+              <w:bottom w:type="dxa" w:w="40"/>
+              <w:right w:type="dxa" w:w="80"/>
+            </w:tcMar>
+          </w:tcPr>
+          <w:p>
+            <w:pPr>
+              <w:jc w:val="right"/>
+            </w:pPr>
+            <w:r>
+              <w:rPr>
+                <w:b w:val="false"/>
+                <w:bCs w:val="false"/>
+                <w:sz w:val="18"/>
+                <w:szCs w:val="18"/>
+              </w:rPr>
+              <w:t xml:space="preserve">161</w:t>
+            </w:r>
+          </w:p>
+        </w:tc>
+      </w:tr>
+      <w:tr>
+        <w:tc>
+          <w:tcPr>
+            <w:tcW w:type="dxa" w:w="6560"/>
+            <w:tcMar>
+              <w:top w:type="dxa" w:w="40"/>
+              <w:left w:type="dxa" w:w="80"/>
+              <w:bottom w:type="dxa" w:w="40"/>
+              <w:right w:type="dxa" w:w="80"/>
+            </w:tcMar>
+          </w:tcPr>
+          <w:p>
+            <w:pPr>
+              <w:jc w:val="left"/>
+            </w:pPr>
+            <w:r>
+              <w:rPr>
+                <w:b w:val="false"/>
+                <w:bCs w:val="false"/>
+                <w:sz w:val="18"/>
+                <w:szCs w:val="18"/>
+              </w:rPr>
+              <w:t xml:space="preserve">RESISTIR_NO_ES_AGUANTAR</w:t>
+            </w:r>
+          </w:p>
+        </w:tc>
+        <w:tc>
+          <w:tcPr>
+            <w:tcW w:type="dxa" w:w="2960"/>
+            <w:tcMar>
+              <w:top w:type="dxa" w:w="40"/>
+              <w:left w:type="dxa" w:w="80"/>
+              <w:bottom w:type="dxa" w:w="40"/>
+              <w:right w:type="dxa" w:w="80"/>
+            </w:tcMar>
+          </w:tcPr>
+          <w:p>
+            <w:pPr>
+              <w:jc w:val="right"/>
+            </w:pPr>
+            <w:r>
+              <w:rPr>
+                <w:b w:val="false"/>
+                <w:bCs w:val="false"/>
+                <w:sz w:val="18"/>
+                <w:szCs w:val="18"/>
+              </w:rPr>
+              <w:t xml:space="preserve">155</w:t>
+            </w:r>
+          </w:p>
+        </w:tc>
+      </w:tr>
+      <w:tr>
+        <w:tc>
+          <w:tcPr>
+            <w:tcW w:type="dxa" w:w="6560"/>
+            <w:tcMar>
+              <w:top w:type="dxa" w:w="40"/>
+              <w:left w:type="dxa" w:w="80"/>
+              <w:bottom w:type="dxa" w:w="40"/>
+              <w:right w:type="dxa" w:w="80"/>
+            </w:tcMar>
+          </w:tcPr>
+          <w:p>
+            <w:pPr>
+              <w:jc w:val="left"/>
+            </w:pPr>
+            <w:r>
+              <w:rPr>
+                <w:b w:val="false"/>
+                <w:bCs w:val="false"/>
+                <w:sz w:val="18"/>
+                <w:szCs w:val="18"/>
+              </w:rPr>
+              <w:t xml:space="preserve">HALLAZGOS_Y_RECOMENDACIONES</w:t>
+            </w:r>
+          </w:p>
+        </w:tc>
+        <w:tc>
+          <w:tcPr>
+            <w:tcW w:type="dxa" w:w="2960"/>
+            <w:tcMar>
+              <w:top w:type="dxa" w:w="40"/>
+              <w:left w:type="dxa" w:w="80"/>
+              <w:bottom w:type="dxa" w:w="40"/>
+              <w:right w:type="dxa" w:w="80"/>
+            </w:tcMar>
+          </w:tcPr>
+          <w:p>
+            <w:pPr>
+              <w:jc w:val="right"/>
+            </w:pPr>
+            <w:r>
+              <w:rPr>
+                <w:b w:val="false"/>
+                <w:bCs w:val="false"/>
+                <w:sz w:val="18"/>
+                <w:szCs w:val="18"/>
+              </w:rPr>
+              <w:t xml:space="preserve">154</w:t>
+            </w:r>
+          </w:p>
+        </w:tc>
+      </w:tr>
+      <w:tr>
+        <w:tc>
+          <w:tcPr>
+            <w:tcW w:type="dxa" w:w="6560"/>
+            <w:tcMar>
+              <w:top w:type="dxa" w:w="40"/>
+              <w:left w:type="dxa" w:w="80"/>
+              <w:bottom w:type="dxa" w:w="40"/>
+              <w:right w:type="dxa" w:w="80"/>
+            </w:tcMar>
+          </w:tcPr>
+          <w:p>
+            <w:pPr>
+              <w:jc w:val="left"/>
+            </w:pPr>
+            <w:r>
+              <w:rPr>
+                <w:b w:val="false"/>
+                <w:bCs w:val="false"/>
+                <w:sz w:val="18"/>
+                <w:szCs w:val="18"/>
+              </w:rPr>
+              <w:t xml:space="preserve">MI_CUERPO_ES_LA_VERDAD</w:t>
+            </w:r>
+          </w:p>
+        </w:tc>
+        <w:tc>
+          <w:tcPr>
+            <w:tcW w:type="dxa" w:w="2960"/>
+            <w:tcMar>
+              <w:top w:type="dxa" w:w="40"/>
+              <w:left w:type="dxa" w:w="80"/>
+              <w:bottom w:type="dxa" w:w="40"/>
+              <w:right w:type="dxa" w:w="80"/>
+            </w:tcMar>
+          </w:tcPr>
+          <w:p>
+            <w:pPr>
+              <w:jc w:val="right"/>
+            </w:pPr>
+            <w:r>
+              <w:rPr>
+                <w:b w:val="false"/>
+                <w:bCs w:val="false"/>
+                <w:sz w:val="18"/>
+                <w:szCs w:val="18"/>
+              </w:rPr>
+              <w:t xml:space="preserve">133</w:t>
+            </w:r>
+          </w:p>
+        </w:tc>
+      </w:tr>
+      <w:tr>
+        <w:tc>
+          <w:tcPr>
+            <w:tcW w:type="dxa" w:w="6560"/>
+            <w:tcMar>
+              <w:top w:type="dxa" w:w="40"/>
+              <w:left w:type="dxa" w:w="80"/>
+              <w:bottom w:type="dxa" w:w="40"/>
+              <w:right w:type="dxa" w:w="80"/>
+            </w:tcMar>
+          </w:tcPr>
+          <w:p>
+            <w:pPr>
+              <w:jc w:val="left"/>
+            </w:pPr>
+            <w:r>
+              <w:rPr>
+                <w:b w:val="false"/>
+                <w:bCs w:val="false"/>
+                <w:sz w:val="18"/>
+                <w:szCs w:val="18"/>
+              </w:rPr>
+              <w:t xml:space="preserve">NO_ES_UN_MAL_MENOR</w:t>
+            </w:r>
+          </w:p>
+        </w:tc>
+        <w:tc>
+          <w:tcPr>
+            <w:tcW w:type="dxa" w:w="2960"/>
+            <w:tcMar>
+              <w:top w:type="dxa" w:w="40"/>
+              <w:left w:type="dxa" w:w="80"/>
+              <w:bottom w:type="dxa" w:w="40"/>
+              <w:right w:type="dxa" w:w="80"/>
+            </w:tcMar>
+          </w:tcPr>
+          <w:p>
+            <w:pPr>
+              <w:jc w:val="right"/>
+            </w:pPr>
+            <w:r>
+              <w:rPr>
+                <w:b w:val="false"/>
+                <w:bCs w:val="false"/>
+                <w:sz w:val="18"/>
+                <w:szCs w:val="18"/>
+              </w:rPr>
+              <w:t xml:space="preserve">105</w:t>
+            </w:r>
+          </w:p>
+        </w:tc>
+      </w:tr>
+      <w:tr>
+        <w:tc>
+          <w:tcPr>
+            <w:tcW w:type="dxa" w:w="6560"/>
+            <w:tcMar>
+              <w:top w:type="dxa" w:w="40"/>
+              <w:left w:type="dxa" w:w="80"/>
+              <w:bottom w:type="dxa" w:w="40"/>
+              <w:right w:type="dxa" w:w="80"/>
+            </w:tcMar>
+          </w:tcPr>
+          <w:p>
+            <w:pPr>
+              <w:jc w:val="left"/>
+            </w:pPr>
+            <w:r>
+              <w:rPr>
+                <w:b w:val="false"/>
+                <w:bCs w:val="false"/>
+                <w:sz w:val="18"/>
+                <w:szCs w:val="18"/>
+              </w:rPr>
+              <w:t xml:space="preserve">SUFRIR_LA_GUERRA_Y_REHACER_LA_VIDA</w:t>
+            </w:r>
+          </w:p>
+        </w:tc>
+        <w:tc>
+          <w:tcPr>
+            <w:tcW w:type="dxa" w:w="2960"/>
+            <w:tcMar>
+              <w:top w:type="dxa" w:w="40"/>
+              <w:left w:type="dxa" w:w="80"/>
+              <w:bottom w:type="dxa" w:w="40"/>
+              <w:right w:type="dxa" w:w="80"/>
+            </w:tcMar>
+          </w:tcPr>
+          <w:p>
+            <w:pPr>
+              <w:jc w:val="right"/>
+            </w:pPr>
+            <w:r>
+              <w:rPr>
+                <w:b w:val="false"/>
+                <w:bCs w:val="false"/>
+                <w:sz w:val="18"/>
+                <w:szCs w:val="18"/>
+              </w:rPr>
+              <w:t xml:space="preserve">74</w:t>
+            </w:r>
+          </w:p>
+        </w:tc>
+      </w:tr>
+      <w:tr>
+        <w:tc>
+          <w:tcPr>
+            <w:tcW w:type="dxa" w:w="6560"/>
+            <w:tcMar>
+              <w:top w:type="dxa" w:w="40"/>
+              <w:left w:type="dxa" w:w="80"/>
+              <w:bottom w:type="dxa" w:w="40"/>
+              <w:right w:type="dxa" w:w="80"/>
+            </w:tcMar>
+          </w:tcPr>
+          <w:p>
+            <w:pPr>
+              <w:jc w:val="left"/>
+            </w:pPr>
+            <w:r>
+              <w:rPr>
+                <w:b w:val="false"/>
+                <w:bCs w:val="false"/>
+                <w:sz w:val="18"/>
+                <w:szCs w:val="18"/>
+              </w:rPr>
+              <w:t xml:space="preserve">CONVOCATORIA_A_LA_PAZ_GRANDE</w:t>
+            </w:r>
+          </w:p>
+        </w:tc>
+        <w:tc>
+          <w:tcPr>
+            <w:tcW w:type="dxa" w:w="2960"/>
+            <w:tcMar>
+              <w:top w:type="dxa" w:w="40"/>
+              <w:left w:type="dxa" w:w="80"/>
+              <w:bottom w:type="dxa" w:w="40"/>
+              <w:right w:type="dxa" w:w="80"/>
+            </w:tcMar>
+          </w:tcPr>
+          <w:p>
+            <w:pPr>
+              <w:jc w:val="right"/>
+            </w:pPr>
+            <w:r>
+              <w:rPr>
+                <w:b w:val="false"/>
+                <w:bCs w:val="false"/>
+                <w:sz w:val="18"/>
+                <w:szCs w:val="18"/>
+              </w:rPr>
+              <w:t xml:space="preserve">0</w:t>
+            </w:r>
+          </w:p>
+        </w:tc>
+      </w:tr>
+    </w:tbl>
     <w:p>
       <w:pPr>
         <w:spacing w:after="20" w:before="60"/>
@@ -2007,6 +3060,40 @@
     </w:p>
     <w:p>
       <w:pPr>
+        <w:pStyle w:val="ListParagraph"/>
+        <w:numPr>
+          <w:ilvl w:val="0"/>
+          <w:numId w:val="1"/>
+        </w:numPr>
+        <w:spacing w:after="40"/>
+      </w:pPr>
+      <w:r>
+        <w:rPr>
+          <w:sz w:val="20"/>
+          <w:szCs w:val="20"/>
+        </w:rPr>
+        <w:t xml:space="preserve">El campo es_relato no tiene la misma semántica en los diez tomos: en nueve marca testimonios delimitados por «», y en Cuando los pájaros no cantaban marca unidades bajo subtítulo de testimonio.</w:t>
+      </w:r>
+    </w:p>
+    <w:p>
+      <w:pPr>
+        <w:pStyle w:val="ListParagraph"/>
+        <w:numPr>
+          <w:ilvl w:val="0"/>
+          <w:numId w:val="1"/>
+        </w:numPr>
+        <w:spacing w:after="40"/>
+      </w:pPr>
+      <w:r>
+        <w:rPr>
+          <w:sz w:val="20"/>
+          <w:szCs w:val="20"/>
+        </w:rPr>
+        <w:t xml:space="preserve">El archivo de entrevistas es un insumo local no versionado (231 MB); la reproducibilidad depende de verificar su hash SHA-256 y de instalar exactamente el modelo spaCy es_core_news_md documentado.</w:t>
+      </w:r>
+    </w:p>
+    <w:p>
+      <w:pPr>
         <w:spacing w:after="100" w:before="80"/>
       </w:pPr>
       <w:r>
@@ -2017,6 +3104,494 @@
         <w:t xml:space="preserve">El hallazgo metodológico central del taller no fue un ajuste de parámetros sino un diagnóstico: la similitud coseno colapsa cuando la consulta cubre casi todo el vocabulario del índice, y ni la normalización de longitud ni la potencia lo resuelven — solo reducir la consulta al tamaño de un pasaje lo hace. La validación cualitativa (coincidencias con puntaje &gt;0,8 que son citas textuales) confirma que, una vez corregido ese sesgo, el sistema sí recupera relaciones temáticas y textuales reales entre las entrevistas y los libros de la Comisión.</w:t>
       </w:r>
     </w:p>
+    <w:p>
+      <w:pPr>
+        <w:pStyle w:val="Heading1"/>
+        <w:spacing w:after="100" w:before="200"/>
+      </w:pPr>
+      <w:r>
+        <w:t xml:space="preserve">8. Mejoras futuras</w:t>
+      </w:r>
+    </w:p>
+    <w:p>
+      <w:pPr>
+        <w:pStyle w:val="ListParagraph"/>
+        <w:numPr>
+          <w:ilvl w:val="0"/>
+          <w:numId w:val="1"/>
+        </w:numPr>
+        <w:spacing w:after="40"/>
+      </w:pPr>
+      <w:r>
+        <w:rPr>
+          <w:sz w:val="20"/>
+          <w:szCs w:val="20"/>
+        </w:rPr>
+        <w:t xml:space="preserve">Anotar relevancia humana para una muestra de consultas y calcular precisión, recall o métricas de ranking, en vez de comparar únicamente el acuerdo entre métricas.</w:t>
+      </w:r>
+    </w:p>
+    <w:p>
+      <w:pPr>
+        <w:pStyle w:val="ListParagraph"/>
+        <w:numPr>
+          <w:ilvl w:val="0"/>
+          <w:numId w:val="1"/>
+        </w:numPr>
+        <w:spacing w:after="40"/>
+      </w:pPr>
+      <w:r>
+        <w:rPr>
+          <w:sz w:val="20"/>
+          <w:szCs w:val="20"/>
+        </w:rPr>
+        <w:t xml:space="preserve">Calibrar k1 y b de BM25 y alpha/beta/gamma de Rocchio contra esa anotación, en vez de usar los valores estándar de la literatura.</w:t>
+      </w:r>
+    </w:p>
+    <w:p>
+      <w:pPr>
+        <w:pStyle w:val="ListParagraph"/>
+        <w:numPr>
+          <w:ilvl w:val="0"/>
+          <w:numId w:val="1"/>
+        </w:numPr>
+        <w:spacing w:after="40"/>
+      </w:pPr>
+      <w:r>
+        <w:rPr>
+          <w:sz w:val="20"/>
+          <w:szCs w:val="20"/>
+        </w:rPr>
+        <w:t xml:space="preserve">Comparar consultas segmentadas a distintos tamaños de pasaje (no solo ~150 palabras) para verificar la sensibilidad del ranking a ese parámetro.</w:t>
+      </w:r>
+    </w:p>
+    <w:p>
+      <w:pPr>
+        <w:pStyle w:val="ListParagraph"/>
+        <w:numPr>
+          <w:ilvl w:val="0"/>
+          <w:numId w:val="1"/>
+        </w:numPr>
+        <w:spacing w:after="40"/>
+      </w:pPr>
+      <w:r>
+        <w:rPr>
+          <w:sz w:val="20"/>
+          <w:szCs w:val="20"/>
+        </w:rPr>
+        <w:t xml:space="preserve">Revisar humanamente los vínculos de baja puntuación del cuadro entrevista-libro, donde la relación temática es menos clara que en los casos de cita textual.</w:t>
+      </w:r>
+    </w:p>
+    <w:p>
+      <w:pPr>
+        <w:pStyle w:val="ListParagraph"/>
+        <w:numPr>
+          <w:ilvl w:val="0"/>
+          <w:numId w:val="1"/>
+        </w:numPr>
+        <w:spacing w:after="40"/>
+      </w:pPr>
+      <w:r>
+        <w:rPr>
+          <w:sz w:val="20"/>
+          <w:szCs w:val="20"/>
+        </w:rPr>
+        <w:t xml:space="preserve">Versionar un manifiesto de hashes de todos los insumos (no solo el archivo de entrevistas) y automatizar una prueba que confirme que los documentos vacíos nunca entran a los índices.</w:t>
+      </w:r>
+    </w:p>
+    <w:p>
+      <w:pPr>
+        <w:pStyle w:val="Heading1"/>
+        <w:spacing w:after="100" w:before="200"/>
+      </w:pPr>
+      <w:r>
+        <w:t xml:space="preserve">9. Entregables finales</w:t>
+      </w:r>
+    </w:p>
+    <w:tbl>
+      <w:tblPr>
+        <w:tblW w:type="dxa" w:w="10080"/>
+        <w:tblBorders>
+          <w:top w:val="single" w:color="auto" w:sz="4"/>
+          <w:left w:val="single" w:color="auto" w:sz="4"/>
+          <w:bottom w:val="single" w:color="auto" w:sz="4"/>
+          <w:right w:val="single" w:color="auto" w:sz="4"/>
+          <w:insideH w:val="single" w:color="auto" w:sz="4"/>
+          <w:insideV w:val="single" w:color="auto" w:sz="4"/>
+        </w:tblBorders>
+      </w:tblPr>
+      <w:tblGrid>
+        <w:gridCol w:w="3200"/>
+        <w:gridCol w:w="6320"/>
+      </w:tblGrid>
+      <w:tr>
+        <w:tc>
+          <w:tcPr>
+            <w:tcW w:type="dxa" w:w="3200"/>
+            <w:shd w:fill="2F5496" w:val="clear"/>
+            <w:tcMar>
+              <w:top w:type="dxa" w:w="40"/>
+              <w:left w:type="dxa" w:w="80"/>
+              <w:bottom w:type="dxa" w:w="40"/>
+              <w:right w:type="dxa" w:w="80"/>
+            </w:tcMar>
+          </w:tcPr>
+          <w:p>
+            <w:pPr>
+              <w:jc w:val="left"/>
+            </w:pPr>
+            <w:r>
+              <w:rPr>
+                <w:b/>
+                <w:bCs/>
+                <w:color w:val="FFFFFF"/>
+                <w:sz w:val="18"/>
+                <w:szCs w:val="18"/>
+              </w:rPr>
+              <w:t xml:space="preserve">Entregable</w:t>
+            </w:r>
+          </w:p>
+        </w:tc>
+        <w:tc>
+          <w:tcPr>
+            <w:tcW w:type="dxa" w:w="6320"/>
+            <w:shd w:fill="2F5496" w:val="clear"/>
+            <w:tcMar>
+              <w:top w:type="dxa" w:w="40"/>
+              <w:left w:type="dxa" w:w="80"/>
+              <w:bottom w:type="dxa" w:w="40"/>
+              <w:right w:type="dxa" w:w="80"/>
+            </w:tcMar>
+          </w:tcPr>
+          <w:p>
+            <w:pPr>
+              <w:jc w:val="left"/>
+            </w:pPr>
+            <w:r>
+              <w:rPr>
+                <w:b/>
+                <w:bCs/>
+                <w:color w:val="FFFFFF"/>
+                <w:sz w:val="18"/>
+                <w:szCs w:val="18"/>
+              </w:rPr>
+              <w:t xml:space="preserve">Ruta</w:t>
+            </w:r>
+          </w:p>
+        </w:tc>
+      </w:tr>
+      <w:tr>
+        <w:tc>
+          <w:tcPr>
+            <w:tcW w:type="dxa" w:w="3200"/>
+            <w:tcMar>
+              <w:top w:type="dxa" w:w="40"/>
+              <w:left w:type="dxa" w:w="80"/>
+              <w:bottom w:type="dxa" w:w="40"/>
+              <w:right w:type="dxa" w:w="80"/>
+            </w:tcMar>
+          </w:tcPr>
+          <w:p>
+            <w:pPr>
+              <w:jc w:val="left"/>
+            </w:pPr>
+            <w:r>
+              <w:rPr>
+                <w:b w:val="false"/>
+                <w:bCs w:val="false"/>
+                <w:sz w:val="18"/>
+                <w:szCs w:val="18"/>
+              </w:rPr>
+              <w:t xml:space="preserve">Corpus extraído y preprocesado</w:t>
+            </w:r>
+          </w:p>
+        </w:tc>
+        <w:tc>
+          <w:tcPr>
+            <w:tcW w:type="dxa" w:w="6320"/>
+            <w:tcMar>
+              <w:top w:type="dxa" w:w="40"/>
+              <w:left w:type="dxa" w:w="80"/>
+              <w:bottom w:type="dxa" w:w="40"/>
+              <w:right w:type="dxa" w:w="80"/>
+            </w:tcMar>
+          </w:tcPr>
+          <w:p>
+            <w:pPr>
+              <w:jc w:val="left"/>
+            </w:pPr>
+            <w:r>
+              <w:rPr>
+                <w:b w:val="false"/>
+                <w:bCs w:val="false"/>
+                <w:sz w:val="18"/>
+                <w:szCs w:val="18"/>
+              </w:rPr>
+              <w:t xml:space="preserve">corpus/*.json, data/corpus_raw.json, data/corpus_preprocesado.json</w:t>
+            </w:r>
+          </w:p>
+        </w:tc>
+      </w:tr>
+      <w:tr>
+        <w:tc>
+          <w:tcPr>
+            <w:tcW w:type="dxa" w:w="3200"/>
+            <w:tcMar>
+              <w:top w:type="dxa" w:w="40"/>
+              <w:left w:type="dxa" w:w="80"/>
+              <w:bottom w:type="dxa" w:w="40"/>
+              <w:right w:type="dxa" w:w="80"/>
+            </w:tcMar>
+          </w:tcPr>
+          <w:p>
+            <w:pPr>
+              <w:jc w:val="left"/>
+            </w:pPr>
+            <w:r>
+              <w:rPr>
+                <w:b w:val="false"/>
+                <w:bCs w:val="false"/>
+                <w:sz w:val="18"/>
+                <w:szCs w:val="18"/>
+              </w:rPr>
+              <w:t xml:space="preserve">Informe de análisis exploratorio</w:t>
+            </w:r>
+          </w:p>
+        </w:tc>
+        <w:tc>
+          <w:tcPr>
+            <w:tcW w:type="dxa" w:w="6320"/>
+            <w:tcMar>
+              <w:top w:type="dxa" w:w="40"/>
+              <w:left w:type="dxa" w:w="80"/>
+              <w:bottom w:type="dxa" w:w="40"/>
+              <w:right w:type="dxa" w:w="80"/>
+            </w:tcMar>
+          </w:tcPr>
+          <w:p>
+            <w:pPr>
+              <w:jc w:val="left"/>
+            </w:pPr>
+            <w:r>
+              <w:rPr>
+                <w:b w:val="false"/>
+                <w:bCs w:val="false"/>
+                <w:sz w:val="18"/>
+                <w:szCs w:val="18"/>
+              </w:rPr>
+              <w:t xml:space="preserve">data/analisis_exploratorio.json y figuras/</w:t>
+            </w:r>
+          </w:p>
+        </w:tc>
+      </w:tr>
+      <w:tr>
+        <w:tc>
+          <w:tcPr>
+            <w:tcW w:type="dxa" w:w="3200"/>
+            <w:tcMar>
+              <w:top w:type="dxa" w:w="40"/>
+              <w:left w:type="dxa" w:w="80"/>
+              <w:bottom w:type="dxa" w:w="40"/>
+              <w:right w:type="dxa" w:w="80"/>
+            </w:tcMar>
+          </w:tcPr>
+          <w:p>
+            <w:pPr>
+              <w:jc w:val="left"/>
+            </w:pPr>
+            <w:r>
+              <w:rPr>
+                <w:b w:val="false"/>
+                <w:bCs w:val="false"/>
+                <w:sz w:val="18"/>
+                <w:szCs w:val="18"/>
+              </w:rPr>
+              <w:t xml:space="preserve">Código y resultados TF-IDF</w:t>
+            </w:r>
+          </w:p>
+        </w:tc>
+        <w:tc>
+          <w:tcPr>
+            <w:tcW w:type="dxa" w:w="6320"/>
+            <w:tcMar>
+              <w:top w:type="dxa" w:w="40"/>
+              <w:left w:type="dxa" w:w="80"/>
+              <w:bottom w:type="dxa" w:w="40"/>
+              <w:right w:type="dxa" w:w="80"/>
+            </w:tcMar>
+          </w:tcPr>
+          <w:p>
+            <w:pPr>
+              <w:jc w:val="left"/>
+            </w:pPr>
+            <w:r>
+              <w:rPr>
+                <w:b w:val="false"/>
+                <w:bCs w:val="false"/>
+                <w:sz w:val="18"/>
+                <w:szCs w:val="18"/>
+              </w:rPr>
+              <w:t xml:space="preserve">modelo_ir.py y data/ranking_tfidf.json</w:t>
+            </w:r>
+          </w:p>
+        </w:tc>
+      </w:tr>
+      <w:tr>
+        <w:tc>
+          <w:tcPr>
+            <w:tcW w:type="dxa" w:w="3200"/>
+            <w:tcMar>
+              <w:top w:type="dxa" w:w="40"/>
+              <w:left w:type="dxa" w:w="80"/>
+              <w:bottom w:type="dxa" w:w="40"/>
+              <w:right w:type="dxa" w:w="80"/>
+            </w:tcMar>
+          </w:tcPr>
+          <w:p>
+            <w:pPr>
+              <w:jc w:val="left"/>
+            </w:pPr>
+            <w:r>
+              <w:rPr>
+                <w:b w:val="false"/>
+                <w:bCs w:val="false"/>
+                <w:sz w:val="18"/>
+                <w:szCs w:val="18"/>
+              </w:rPr>
+              <w:t xml:space="preserve">Rocchio y BM25 manuales</w:t>
+            </w:r>
+          </w:p>
+        </w:tc>
+        <w:tc>
+          <w:tcPr>
+            <w:tcW w:type="dxa" w:w="6320"/>
+            <w:tcMar>
+              <w:top w:type="dxa" w:w="40"/>
+              <w:left w:type="dxa" w:w="80"/>
+              <w:bottom w:type="dxa" w:w="40"/>
+              <w:right w:type="dxa" w:w="80"/>
+            </w:tcMar>
+          </w:tcPr>
+          <w:p>
+            <w:pPr>
+              <w:jc w:val="left"/>
+            </w:pPr>
+            <w:r>
+              <w:rPr>
+                <w:b w:val="false"/>
+                <w:bCs w:val="false"/>
+                <w:sz w:val="18"/>
+                <w:szCs w:val="18"/>
+              </w:rPr>
+              <w:t xml:space="preserve">modelos_relevancia.py, data/ranking_rocchio.json, data/ranking_bm25.json</w:t>
+            </w:r>
+          </w:p>
+        </w:tc>
+      </w:tr>
+      <w:tr>
+        <w:tc>
+          <w:tcPr>
+            <w:tcW w:type="dxa" w:w="3200"/>
+            <w:tcMar>
+              <w:top w:type="dxa" w:w="40"/>
+              <w:left w:type="dxa" w:w="80"/>
+              <w:bottom w:type="dxa" w:w="40"/>
+              <w:right w:type="dxa" w:w="80"/>
+            </w:tcMar>
+          </w:tcPr>
+          <w:p>
+            <w:pPr>
+              <w:jc w:val="left"/>
+            </w:pPr>
+            <w:r>
+              <w:rPr>
+                <w:b w:val="false"/>
+                <w:bCs w:val="false"/>
+                <w:sz w:val="18"/>
+                <w:szCs w:val="18"/>
+              </w:rPr>
+              <w:t xml:space="preserve">Cuadro y gráfico de relacionamiento</w:t>
+            </w:r>
+          </w:p>
+        </w:tc>
+        <w:tc>
+          <w:tcPr>
+            <w:tcW w:type="dxa" w:w="6320"/>
+            <w:tcMar>
+              <w:top w:type="dxa" w:w="40"/>
+              <w:left w:type="dxa" w:w="80"/>
+              <w:bottom w:type="dxa" w:w="40"/>
+              <w:right w:type="dxa" w:w="80"/>
+            </w:tcMar>
+          </w:tcPr>
+          <w:p>
+            <w:pPr>
+              <w:jc w:val="left"/>
+            </w:pPr>
+            <w:r>
+              <w:rPr>
+                <w:b w:val="false"/>
+                <w:bCs w:val="false"/>
+                <w:sz w:val="18"/>
+                <w:szCs w:val="18"/>
+              </w:rPr>
+              <w:t xml:space="preserve">data/cuadro_vinculos.json, figuras/heatmap_vinculos_tfidf.png</w:t>
+            </w:r>
+          </w:p>
+        </w:tc>
+      </w:tr>
+      <w:tr>
+        <w:tc>
+          <w:tcPr>
+            <w:tcW w:type="dxa" w:w="3200"/>
+            <w:tcMar>
+              <w:top w:type="dxa" w:w="40"/>
+              <w:left w:type="dxa" w:w="80"/>
+              <w:bottom w:type="dxa" w:w="40"/>
+              <w:right w:type="dxa" w:w="80"/>
+            </w:tcMar>
+          </w:tcPr>
+          <w:p>
+            <w:pPr>
+              <w:jc w:val="left"/>
+            </w:pPr>
+            <w:r>
+              <w:rPr>
+                <w:b w:val="false"/>
+                <w:bCs w:val="false"/>
+                <w:sz w:val="18"/>
+                <w:szCs w:val="18"/>
+              </w:rPr>
+              <w:t xml:space="preserve">Informe final integrador</w:t>
+            </w:r>
+          </w:p>
+        </w:tc>
+        <w:tc>
+          <w:tcPr>
+            <w:tcW w:type="dxa" w:w="6320"/>
+            <w:tcMar>
+              <w:top w:type="dxa" w:w="40"/>
+              <w:left w:type="dxa" w:w="80"/>
+              <w:bottom w:type="dxa" w:w="40"/>
+              <w:right w:type="dxa" w:w="80"/>
+            </w:tcMar>
+          </w:tcPr>
+          <w:p>
+            <w:pPr>
+              <w:jc w:val="left"/>
+            </w:pPr>
+            <w:r>
+              <w:rPr>
+                <w:b w:val="false"/>
+                <w:bCs w:val="false"/>
+                <w:sz w:val="18"/>
+                <w:szCs w:val="18"/>
+              </w:rPr>
+              <w:t xml:space="preserve">informe-taller3-IR.md</w:t>
+            </w:r>
+          </w:p>
+        </w:tc>
+      </w:tr>
+    </w:tbl>
     <w:sectPr>
       <w:pgSz w:w="12240" w:h="15840" w:orient="portrait"/>
       <w:pgMar w:top="1080" w:right="1080" w:bottom="1080" w:left="1080" w:header="708" w:footer="708" w:gutter="0"/>

</xml_diff>